<commit_message>
docs: add map elevation viewer link; update QR codes doc
README: link the published GitHub Pages elevation viewer.
QR codes.docx: latest content edits.

Co-Authored-By: Claude Opus 4.8 (1M context) <noreply@anthropic.com>
</commit_message>
<xml_diff>
--- a/QR codes.docx
+++ b/QR codes.docx
@@ -7,7 +7,11 @@
         <w:t>Telemetry User Guide</w:t>
       </w:r>
     </w:p>
-    <w:p/>
+    <w:p>
+      <w:r>
+        <w:t>Coming soon</w:t>
+      </w:r>
+    </w:p>
     <w:p/>
     <w:p>
       <w:r>
@@ -20,8 +24,8 @@
           <w:noProof/>
         </w:rPr>
         <w:drawing>
-          <wp:inline distT="0" distB="0" distL="0" distR="0" wp14:anchorId="305F0AC3" wp14:editId="492C9FA0">
-            <wp:extent cx="2046849" cy="2046849"/>
+          <wp:inline distT="0" distB="0" distL="0" distR="0" wp14:anchorId="305F0AC3" wp14:editId="45A730F9">
+            <wp:extent cx="2138290" cy="2138290"/>
             <wp:effectExtent l="0" t="0" r="0" b="0"/>
             <wp:docPr id="647460098" name="Graphic 2"/>
             <wp:cNvGraphicFramePr>
@@ -49,7 +53,7 @@
                   <pic:spPr>
                     <a:xfrm>
                       <a:off x="0" y="0"/>
-                      <a:ext cx="2054548" cy="2054548"/>
+                      <a:ext cx="2147528" cy="2147528"/>
                     </a:xfrm>
                     <a:prstGeom prst="rect">
                       <a:avLst/>

</xml_diff>